<commit_message>
Publish the current build
Synced by platform/publish_site.py, which checks the site against Files/outputs before and after.
</commit_message>
<xml_diff>
--- a/PV2_Workflow_Documentation.docx
+++ b/PV2_Workflow_Documentation.docx
@@ -565,7 +565,7 @@
           <w:b w:val="0"/>
           <w:sz w:val="23"/>
         </w:rPr>
-        <w:t xml:space="preserve">, 59 Python files in eight subpackages, 15,284 lines (appendix A, which </w:t>
+        <w:t xml:space="preserve">, 59 Python files in eight subpackages, 15,303 lines (appendix A, which </w:t>
       </w:r>
       <w:r>
         <w:rPr>
@@ -6072,7 +6072,7 @@
           <w:b w:val="0"/>
           <w:sz w:val="23"/>
         </w:rPr>
-        <w:t xml:space="preserve"> is the issue log, 91 numbered W-entries at the time of writing, each with what happened, why, the fix, its status and the date first seen; an entry is never deleted, and a fixed one keeps its story. </w:t>
+        <w:t xml:space="preserve"> is the issue log, 92 numbered W-entries at the time of writing, each with what happened, why, the fix, its status and the date first seen; an entry is never deleted, and a fixed one keeps its story. </w:t>
       </w:r>
       <w:r>
         <w:rPr>
@@ -7093,7 +7093,7 @@
                 <w:b w:val="0"/>
                 <w:sz w:val="19"/>
               </w:rPr>
-              <w:t>2,974</w:t>
+              <w:t>2,993</w:t>
             </w:r>
           </w:p>
         </w:tc>
@@ -7158,7 +7158,7 @@
                 <w:b w:val="0"/>
                 <w:sz w:val="19"/>
               </w:rPr>
-              <w:t>15,284</w:t>
+              <w:t>15,303</w:t>
             </w:r>
           </w:p>
         </w:tc>
@@ -7678,7 +7678,7 @@
                 <w:b w:val="0"/>
                 <w:sz w:val="19"/>
               </w:rPr>
-              <w:t>1,349</w:t>
+              <w:t>1,361</w:t>
             </w:r>
           </w:p>
         </w:tc>

</xml_diff>